<commit_message>
Supplement resume with prior CV details
Co-authored-by: yanatimofeeva2511 <yanatimofeeva2511@users.noreply.github.com>
</commit_message>
<xml_diff>
--- a/resume_clevel_fintech_ru_editable.docx
+++ b/resume_clevel_fintech_ru_editable.docx
@@ -7,7 +7,7 @@
         <w:pStyle w:val="Title"/>
       </w:pPr>
       <w:r>
-        <w:t xml:space="preserve">[Имя Фамилия]</w:t>
+        <w:t xml:space="preserve">Яна Тимофеева</w:t>
       </w:r>
     </w:p>
     <w:p>
@@ -25,7 +25,7 @@
     </w:p>
     <w:p>
       <w:r>
-        <w:t xml:space="preserve">[город] · [телефон] · [email]</w:t>
+        <w:t xml:space="preserve">Москва · +7 (903) 725-82-18 · ia.timofeeva@yandex.ru</w:t>
       </w:r>
     </w:p>
     <w:p>
@@ -48,7 +48,7 @@
     </w:p>
     <w:p>
       <w:r>
-        <w:t xml:space="preserve">20+ лет · 25 млн клиентов · 20 млн клиентов без простоя при замене процессинга · 2 млн участников федерального проекта · +25% YoY к активной клиентской базе · AUM +35% · 88% NTB · N1 / N2 / N5 рыночные позиции</w:t>
+        <w:t xml:space="preserve">20+ лет · 25 млн клиентов · 20 млн клиентов без простоя при замене процессинга · 2 млн участников федерального проекта · 170 человек / 12 бизнес-команд · 600+ точек продаж · портфель 70 млрд руб. · AUM +35% · 88% NTB · английский C2</w:t>
       </w:r>
     </w:p>
     <w:p>
@@ -216,29 +216,29 @@
         </w:numPr>
       </w:pPr>
       <w:r>
-        <w:t xml:space="preserve">Розничный банковский бизнес и P&amp;L: самостоятельные бизнес-направления, продуктовая стратегия, экономика привлечения, инвестиционная логика, окупаемость, KPI.</w:t>
-      </w:r>
-    </w:p>
-    <w:p>
-      <w:pPr>
-        <w:numPr>
-          <w:ilvl w:val="0"/>
-          <w:numId w:val="1"/>
-        </w:numPr>
-      </w:pPr>
-      <w:r>
-        <w:t xml:space="preserve">Продукты и клиентский рост: дебетовые карты, депозиты, инвестиционные и страховые продукты, расчетные продукты, зарплатные проекты, автокредитование, РКО, AUM, NTB, удержание и отток.</w:t>
-      </w:r>
-    </w:p>
-    <w:p>
-      <w:pPr>
-        <w:numPr>
-          <w:ilvl w:val="0"/>
-          <w:numId w:val="1"/>
-        </w:numPr>
-      </w:pPr>
-      <w:r>
-        <w:t xml:space="preserve">Каналы и партнерства: собственная и партнерская дистрибуция, партнерские программы, экосистемные каналы, маркетинг и CRM.</w:t>
+        <w:t xml:space="preserve">Розничный банковский бизнес и P&amp;L: самостоятельные бизнес-направления, продуктовая стратегия, экономика привлечения, инвестиционная логика, окупаемость, P&amp;L, CIR, KPI.</w:t>
+      </w:r>
+    </w:p>
+    <w:p>
+      <w:pPr>
+        <w:numPr>
+          <w:ilvl w:val="0"/>
+          <w:numId w:val="1"/>
+        </w:numPr>
+      </w:pPr>
+      <w:r>
+        <w:t xml:space="preserve">Продукты и клиентский рост: дебетовые и зарплатные карты, депозиты, накопительные счета, инвестиционные и страховые продукты, расчетные продукты, платежи и переводы, автокредитование, РКО, AUM, NTB, MAU/DAU, pNPS, удержание и отток.</w:t>
+      </w:r>
+    </w:p>
+    <w:p>
+      <w:pPr>
+        <w:numPr>
+          <w:ilvl w:val="0"/>
+          <w:numId w:val="1"/>
+        </w:numPr>
+      </w:pPr>
+      <w:r>
+        <w:t xml:space="preserve">Каналы и партнерства: собственная и партнерская дистрибуция, региональная сеть, партнерские программы, экосистемные каналы, модели продаж, мотивация, маркетинг и CRM.</w:t>
       </w:r>
     </w:p>
     <w:p>
@@ -281,105 +281,146 @@
         <w:pStyle w:val="Heading2"/>
       </w:pPr>
       <w:r>
+        <w:t xml:space="preserve">ВТБ</w:t>
+      </w:r>
+    </w:p>
+    <w:p>
+      <w:r>
+        <w:t xml:space="preserve">Дебетовые карты, расчетные продукты, процессинг, федеральные программы · [актуальная должность и период после 2022 - уточнить]</w:t>
+      </w:r>
+    </w:p>
+    <w:p>
+      <w:pPr>
+        <w:numPr>
+          <w:ilvl w:val="0"/>
+          <w:numId w:val="1"/>
+        </w:numPr>
+      </w:pPr>
+      <w:r>
+        <w:t xml:space="preserve">Скорректировала стратегию дебетовых карт и расчетных продуктов под рост активной клиентской базы: определены инструменты и стоимость привлечения, найдены источники финансирования.</w:t>
+      </w:r>
+    </w:p>
+    <w:p>
+      <w:pPr>
+        <w:numPr>
+          <w:ilvl w:val="0"/>
+          <w:numId w:val="1"/>
+        </w:numPr>
+      </w:pPr>
+      <w:r>
+        <w:t xml:space="preserve">Реализовала продуктовые, маркетинговые и дистрибуционные изменения одновременно с масштабной IT-трансформацией.</w:t>
+      </w:r>
+    </w:p>
+    <w:p>
+      <w:pPr>
+        <w:numPr>
+          <w:ilvl w:val="0"/>
+          <w:numId w:val="1"/>
+        </w:numPr>
+      </w:pPr>
+      <w:r>
+        <w:t xml:space="preserve">Достигнута рыночная позиция N2 по активной клиентской базе: 25 млн клиентов, рост +25% YoY.</w:t>
+      </w:r>
+    </w:p>
+    <w:p>
+      <w:pPr>
+        <w:numPr>
+          <w:ilvl w:val="0"/>
+          <w:numId w:val="1"/>
+        </w:numPr>
+      </w:pPr>
+      <w:r>
+        <w:t xml:space="preserve">Проведено импортозамещение и бесшовная замена процессинга для 20 млн действующих клиентов без простоя в операциях.</w:t>
+      </w:r>
+    </w:p>
+    <w:p>
+      <w:pPr>
+        <w:numPr>
+          <w:ilvl w:val="0"/>
+          <w:numId w:val="1"/>
+        </w:numPr>
+      </w:pPr>
+      <w:r>
+        <w:t xml:space="preserve">Реализован федеральный проект по миграции 2 млн детей с Пушкинскими картами за 8 месяцев: концепция, продукт, процесс миграции, технологические интеграции с регулятором, нормативная база и бесшовное переключение.</w:t>
+      </w:r>
+    </w:p>
+    <w:p>
+      <w:pPr>
+        <w:pStyle w:val="Heading2"/>
+      </w:pPr>
+      <w:r>
         <w:t xml:space="preserve">ФК Банк Открытие</w:t>
       </w:r>
     </w:p>
     <w:p>
       <w:r>
-        <w:t xml:space="preserve">Пассивный и расчетный бизнес, клиентская база, миграции, Agile-трансформация, кризисное управление · [должность] · [период]</w:t>
-      </w:r>
-    </w:p>
-    <w:p>
-      <w:r>
-        <w:t xml:space="preserve">Мандат: запуск и развитие пассивного и расчетного бизнеса, управление продуктовой линейкой и клиентской базой, реализация крупных технологических и организационных изменений.</w:t>
-      </w:r>
-    </w:p>
-    <w:p>
-      <w:pPr>
-        <w:numPr>
-          <w:ilvl w:val="0"/>
-          <w:numId w:val="1"/>
-        </w:numPr>
-      </w:pPr>
-      <w:r>
-        <w:t xml:space="preserve">Запустил пассивный и расчетный бизнес: депозитные, инвестиционные и страховые продукты, дебетовые карты, зарплатные проекты.</w:t>
-      </w:r>
-    </w:p>
-    <w:p>
-      <w:pPr>
-        <w:numPr>
-          <w:ilvl w:val="0"/>
-          <w:numId w:val="1"/>
-        </w:numPr>
-      </w:pPr>
-      <w:r>
-        <w:t xml:space="preserve">При переходе к доходной бизнес-модели и ухудшении ценовых параметров продуктового ряда увеличил активную клиентскую базу на 11% до 2,1 млн клиентов.</w:t>
-      </w:r>
-    </w:p>
-    <w:p>
-      <w:pPr>
-        <w:numPr>
-          <w:ilvl w:val="0"/>
-          <w:numId w:val="1"/>
-        </w:numPr>
-      </w:pPr>
-      <w:r>
-        <w:t xml:space="preserve">Улучшил качество клиентского сегмента: средний AUM +35%, транзакционный отток сокращен в 3 раза, РКО выведено на самоокупаемость.</w:t>
-      </w:r>
-    </w:p>
-    <w:p>
-      <w:pPr>
-        <w:numPr>
-          <w:ilvl w:val="0"/>
-          <w:numId w:val="1"/>
-        </w:numPr>
-      </w:pPr>
-      <w:r>
-        <w:t xml:space="preserve">Обеспечил итоговую рыночную позицию N5 по портфелю пассивов и активной клиентской базе, +3 п.п.</w:t>
-      </w:r>
-    </w:p>
-    <w:p>
-      <w:pPr>
-        <w:numPr>
-          <w:ilvl w:val="0"/>
-          <w:numId w:val="1"/>
-        </w:numPr>
-      </w:pPr>
-      <w:r>
-        <w:t xml:space="preserve">Провел бизнес- и технологическую миграцию 1,5 млн клиентов на разных продуктовых линейках и 8 процессингах без клиентского оттока.</w:t>
-      </w:r>
-    </w:p>
-    <w:p>
-      <w:pPr>
-        <w:numPr>
-          <w:ilvl w:val="0"/>
-          <w:numId w:val="1"/>
-        </w:numPr>
-      </w:pPr>
-      <w:r>
-        <w:t xml:space="preserve">Организовал переход структуры управления и разработки на Agile: создание трайбов и запуск управления IT-командами в новой модели.</w:t>
-      </w:r>
-    </w:p>
-    <w:p>
-      <w:pPr>
-        <w:numPr>
-          <w:ilvl w:val="0"/>
-          <w:numId w:val="1"/>
-        </w:numPr>
-      </w:pPr>
-      <w:r>
-        <w:t xml:space="preserve">Управлял первой волной SDN: отключение платежных систем и международных расчетов, синхронизация подразделений банка и регулятора, клиентские коммуникации в условиях отсутствия внешних и внутренних процедур.</w:t>
-      </w:r>
-    </w:p>
-    <w:p>
-      <w:pPr>
-        <w:numPr>
-          <w:ilvl w:val="0"/>
-          <w:numId w:val="1"/>
-        </w:numPr>
-      </w:pPr>
-      <w:r>
-        <w:t xml:space="preserve">Урегулировал требования к платежным системам, изменил правила логистики и персонализации карт, управлял стоками пластика в условиях дефицита чипов.</w:t>
+        <w:t xml:space="preserve">Лидер Трайба Ежедневный Банкинг / Директор департамента сберегательных и комиссионных продуктов · Январь 2021 - после декабря 2022; Февраль 2018 - Декабрь 2020</w:t>
+      </w:r>
+    </w:p>
+    <w:p>
+      <w:pPr>
+        <w:numPr>
+          <w:ilvl w:val="0"/>
+          <w:numId w:val="1"/>
+        </w:numPr>
+      </w:pPr>
+      <w:r>
+        <w:t xml:space="preserve">Развивала направление ежедневного банкинга: дебетовые и зарплатные карты, РКО; ключевая задача - рост клиентской базы через закрытие daily-потребностей клиентов.</w:t>
+      </w:r>
+    </w:p>
+    <w:p>
+      <w:pPr>
+        <w:numPr>
+          <w:ilvl w:val="0"/>
+          <w:numId w:val="1"/>
+        </w:numPr>
+      </w:pPr>
+      <w:r>
+        <w:t xml:space="preserve">Управляла ресурсом 170 человек (продукт + IT, штат/аутсорс), 12 бизнес-команд; KPI: активная клиентская база, продажи/портфель, P&amp;L, CIR, pNPS, MAU/DAU.</w:t>
+      </w:r>
+    </w:p>
+    <w:p>
+      <w:pPr>
+        <w:numPr>
+          <w:ilvl w:val="0"/>
+          <w:numId w:val="1"/>
+        </w:numPr>
+      </w:pPr>
+      <w:r>
+        <w:t xml:space="preserve">Запустила и развила пассивный и расчетный бизнес: депозиты, накопительные счета, дебетовые карты, платежи и переводы, страховые, сервисные и инвестиционные продукты.</w:t>
+      </w:r>
+    </w:p>
+    <w:p>
+      <w:pPr>
+        <w:numPr>
+          <w:ilvl w:val="0"/>
+          <w:numId w:val="1"/>
+        </w:numPr>
+      </w:pPr>
+      <w:r>
+        <w:t xml:space="preserve">При переходе к доходной бизнес-модели увеличила активную клиентскую базу на 11% до 2,1 млн клиентов; средний AUM +35%, транзакционный отток сокращен в 3 раза, РКО выведено на самоокупаемость.</w:t>
+      </w:r>
+    </w:p>
+    <w:p>
+      <w:pPr>
+        <w:numPr>
+          <w:ilvl w:val="0"/>
+          <w:numId w:val="1"/>
+        </w:numPr>
+      </w:pPr>
+      <w:r>
+        <w:t xml:space="preserve">Провела бизнес- и технологическую миграцию 1,5 млн клиентов на разных продуктовых линейках и 8 процессингах без клиентского оттока; организовала переход структуры управления и разработки на Agile.</w:t>
+      </w:r>
+    </w:p>
+    <w:p>
+      <w:pPr>
+        <w:numPr>
+          <w:ilvl w:val="0"/>
+          <w:numId w:val="1"/>
+        </w:numPr>
+      </w:pPr>
+      <w:r>
+        <w:t xml:space="preserve">Продукты и сервисы направления входили в рейтинги Frank RG: лучшая дебетовая карта 2021 - N1, Premium Light 2022 - N1, лучший банк для премиальных клиентов 2022 - N2.</w:t>
       </w:r>
     </w:p>
     <w:p>
@@ -392,23 +433,29 @@
     </w:p>
     <w:p>
       <w:r>
-        <w:t xml:space="preserve">Дебетовые карты, расчетные продукты, автокредитование, процессинг, федеральные программы · [должность] · [период]</w:t>
-      </w:r>
-    </w:p>
-    <w:p>
-      <w:r>
-        <w:t xml:space="preserve">Мандат: запуск новых розничных направлений, рост активной клиентской базы, трансформация карточных и расчетных продуктов, управление федеральными и технологическими программами.</w:t>
-      </w:r>
-    </w:p>
-    <w:p>
-      <w:pPr>
-        <w:numPr>
-          <w:ilvl w:val="0"/>
-          <w:numId w:val="1"/>
-        </w:numPr>
-      </w:pPr>
-      <w:r>
-        <w:t xml:space="preserve">Запустил автокредитование как самостоятельное бизнес-направление со stand-alone моделью, собственной и партнерской сетью дистрибуции.</w:t>
+        <w:t xml:space="preserve">Сберегательные и комиссионные продукты; автобизнес и автокредитование · Февраль 2017 - Январь 2018; Декабрь 2005 - Октябрь 2015</w:t>
+      </w:r>
+    </w:p>
+    <w:p>
+      <w:pPr>
+        <w:numPr>
+          <w:ilvl w:val="0"/>
+          <w:numId w:val="1"/>
+        </w:numPr>
+      </w:pPr>
+      <w:r>
+        <w:t xml:space="preserve">В Банке ВТБ управляла розничным портфелем сберегательных и комиссионных продуктов: стратегия, планирование портфелей/продаж/доходов, запуск продуктовых предложений под сегменты, модели продаж, мотивация и партнерства.</w:t>
+      </w:r>
+    </w:p>
+    <w:p>
+      <w:pPr>
+        <w:numPr>
+          <w:ilvl w:val="0"/>
+          <w:numId w:val="1"/>
+        </w:numPr>
+      </w:pPr>
+      <w:r>
+        <w:t xml:space="preserve">В ВТБ24 запустила и развила автокредитование как самостоятельное бизнес-направление со stand-alone моделью, собственной и партнерской сетью дистрибуции.</w:t>
       </w:r>
     </w:p>
     <w:p>
@@ -430,51 +477,29 @@
         </w:numPr>
       </w:pPr>
       <w:r>
-        <w:t xml:space="preserve">Скорректировал стратегию дебетовых карт и расчетных продуктов под рост активной клиентской базы: определил инструменты и стоимость привлечения, нашел источники финансирования.</w:t>
-      </w:r>
-    </w:p>
-    <w:p>
-      <w:pPr>
-        <w:numPr>
-          <w:ilvl w:val="0"/>
-          <w:numId w:val="1"/>
-        </w:numPr>
-      </w:pPr>
-      <w:r>
-        <w:t xml:space="preserve">Реализовал продуктовые, маркетинговые и дистрибуционные изменения одновременно с масштабной IT-трансформацией.</w:t>
-      </w:r>
-    </w:p>
-    <w:p>
-      <w:pPr>
-        <w:numPr>
-          <w:ilvl w:val="0"/>
-          <w:numId w:val="1"/>
-        </w:numPr>
-      </w:pPr>
-      <w:r>
-        <w:t xml:space="preserve">Достиг рыночной позиции N2 по активной клиентской базе: 25 млн клиентов, рост +25% YoY.</w:t>
-      </w:r>
-    </w:p>
-    <w:p>
-      <w:pPr>
-        <w:numPr>
-          <w:ilvl w:val="0"/>
-          <w:numId w:val="1"/>
-        </w:numPr>
-      </w:pPr>
-      <w:r>
-        <w:t xml:space="preserve">Провел импортозамещение и бесшовную замену процессинга для 20 млн действующих клиентов без простоя в операциях.</w:t>
-      </w:r>
-    </w:p>
-    <w:p>
-      <w:pPr>
-        <w:numPr>
-          <w:ilvl w:val="0"/>
-          <w:numId w:val="1"/>
-        </w:numPr>
-      </w:pPr>
-      <w:r>
-        <w:t xml:space="preserve">Возглавил федеральный проект по миграции 2 млн детей с Пушкинскими картами за 8 месяцев: концепция, разработка продукта, процесс миграции, технологические интеграции с регулятором, нормативная база и бесшовное переключение.</w:t>
+        <w:t xml:space="preserve">Управляла продуктом, клиентским предложением, процедурами, бюджетами, портфелем, продажами и сделками по покупке/секьюритизации портфелей.</w:t>
+      </w:r>
+    </w:p>
+    <w:p>
+      <w:pPr>
+        <w:numPr>
+          <w:ilvl w:val="0"/>
+          <w:numId w:val="1"/>
+        </w:numPr>
+      </w:pPr>
+      <w:r>
+        <w:t xml:space="preserve">Масштаб управления: 40 человек в прямом подчинении, 1500 человек функционального подчинения в региональной сети, 600+ точек продаж.</w:t>
+      </w:r>
+    </w:p>
+    <w:p>
+      <w:pPr>
+        <w:numPr>
+          <w:ilvl w:val="0"/>
+          <w:numId w:val="1"/>
+        </w:numPr>
+      </w:pPr>
+      <w:r>
+        <w:t xml:space="preserve">Создана продуктовая модель автокредитования: 10+ основных продуктов, 300+ программ, 1,5 тыс. промо-акций; портфель вырос до 70 млрд руб., ежегодное исполнение плана по прибыли 93-104%.</w:t>
       </w:r>
     </w:p>
     <w:p>
@@ -482,12 +507,13 @@
         <w:pStyle w:val="Heading1"/>
       </w:pPr>
       <w:r>
-        <w:t xml:space="preserve">Образование и дополнительная информация</w:t>
-      </w:r>
-    </w:p>
-    <w:p>
-      <w:r>
-        <w:t xml:space="preserve">[Образование] · [Executive-программы / бизнес-школа, если релевантно] · [Языки]</w:t>
+        <w:t xml:space="preserve">Образование и языки</w:t>
+      </w:r>
+    </w:p>
+    <w:p>
+      <w:r>
+        <w:t xml:space="preserve">МГОУ, Москва, 1998 - Менеджмент и экономическая политика, менеджер.
+Языки: русский - родной; английский - C2.</w:t>
       </w:r>
     </w:p>
     <w:sectPr>
@@ -537,9 +563,6 @@
       <w:color w:val="0F2742"/>
       <w:sz w:val="36"/>
     </w:rPr>
-    <w:pPr>
-      <w:spacing w:after="80"/>
-    </w:pPr>
   </w:style>
   <w:style w:type="paragraph" w:styleId="Subtitle">
     <w:name w:val="Subtitle"/>
@@ -553,27 +576,25 @@
   <w:style w:type="paragraph" w:styleId="Heading1">
     <w:name w:val="heading 1"/>
     <w:basedOn w:val="Normal"/>
-    <w:next w:val="Normal"/>
     <w:rPr>
       <w:b/>
       <w:color w:val="0F2742"/>
       <w:sz w:val="24"/>
     </w:rPr>
     <w:pPr>
-      <w:spacing w:before="180" w:after="80"/>
+      <w:spacing w:before="160" w:after="80"/>
     </w:pPr>
   </w:style>
   <w:style w:type="paragraph" w:styleId="Heading2">
     <w:name w:val="heading 2"/>
     <w:basedOn w:val="Normal"/>
-    <w:next w:val="Normal"/>
     <w:rPr>
       <w:b/>
       <w:color w:val="173A5E"/>
       <w:sz w:val="22"/>
     </w:rPr>
     <w:pPr>
-      <w:spacing w:before="120" w:after="60"/>
+      <w:spacing w:before="100" w:after="60"/>
     </w:pPr>
   </w:style>
 </w:styles>

</xml_diff>

<commit_message>
Refine first page resume layout
Co-authored-by: yanatimofeeva2511 <yanatimofeeva2511@users.noreply.github.com>
</commit_message>
<xml_diff>
--- a/resume_clevel_fintech_ru_editable.docx
+++ b/resume_clevel_fintech_ru_editable.docx
@@ -47,11 +47,6 @@
       </w:r>
     </w:p>
     <w:p>
-      <w:r>
-        <w:t xml:space="preserve">20+ лет · 25 млн клиентов · 20 млн клиентов без простоя при замене процессинга · 2 млн участников федерального проекта · 170 человек / 12 бизнес-команд · 600+ точек продаж · портфель 70 млрд руб. · AUM +35% · 88% NTB · английский C2</w:t>
-      </w:r>
-    </w:p>
-    <w:p>
       <w:pPr>
         <w:pStyle w:val="Heading1"/>
       </w:pPr>
@@ -114,6 +109,11 @@
       </w:r>
     </w:p>
     <w:p>
+      <w:r>
+        <w:t xml:space="preserve">Подтверждение масштаба: АКБ +11% до 2,1 млн · AUM +35% · отток снижен в 3 раза · N5 по пассивам и АКБ (+3 п.п.) · N1 по автокредитному портфелю · 88% NTB · прибыль с 36-го месяца</w:t>
+      </w:r>
+    </w:p>
+    <w:p>
       <w:pPr>
         <w:pStyle w:val="Heading2"/>
       </w:pPr>
@@ -155,6 +155,11 @@
       </w:r>
     </w:p>
     <w:p>
+      <w:r>
+        <w:t xml:space="preserve">Подтверждение масштаба: 25 млн клиентов · +25% YoY к активной клиентской базе · N2 по АКБ · масштабная IT-трансформация · P&amp;L / CIR / pNPS / MAU / DAU</w:t>
+      </w:r>
+    </w:p>
+    <w:p>
       <w:pPr>
         <w:pStyle w:val="Heading2"/>
       </w:pPr>
@@ -196,6 +201,11 @@
       </w:r>
     </w:p>
     <w:p>
+      <w:r>
+        <w:t xml:space="preserve">Подтверждение масштаба: 1,5 млн клиентов / 8 процессингов · 20 млн клиентов без простоя · 2 млн детей за 8 месяцев · 170 человек / 12 команд · SDN-контур</w:t>
+      </w:r>
+    </w:p>
+    <w:p>
       <w:pPr>
         <w:pStyle w:val="Heading1"/>
       </w:pPr>
@@ -205,62 +215,50 @@
     </w:p>
     <w:p>
       <w:r>
-        <w:t xml:space="preserve">Это не набор формальных навыков, а области, в которых есть hands-on управленческий опыт и подтвержденные бизнес-результаты.</w:t>
-      </w:r>
-    </w:p>
-    <w:p>
-      <w:pPr>
-        <w:numPr>
-          <w:ilvl w:val="0"/>
-          <w:numId w:val="1"/>
-        </w:numPr>
-      </w:pPr>
-      <w:r>
-        <w:t xml:space="preserve">Розничный банковский бизнес и P&amp;L: самостоятельные бизнес-направления, продуктовая стратегия, экономика привлечения, инвестиционная логика, окупаемость, P&amp;L, CIR, KPI.</w:t>
-      </w:r>
-    </w:p>
-    <w:p>
-      <w:pPr>
-        <w:numPr>
-          <w:ilvl w:val="0"/>
-          <w:numId w:val="1"/>
-        </w:numPr>
-      </w:pPr>
-      <w:r>
-        <w:t xml:space="preserve">Продукты и клиентский рост: дебетовые и зарплатные карты, депозиты, накопительные счета, инвестиционные и страховые продукты, расчетные продукты, платежи и переводы, автокредитование, РКО, AUM, NTB, MAU/DAU, pNPS, удержание и отток.</w:t>
-      </w:r>
-    </w:p>
-    <w:p>
-      <w:pPr>
-        <w:numPr>
-          <w:ilvl w:val="0"/>
-          <w:numId w:val="1"/>
-        </w:numPr>
-      </w:pPr>
-      <w:r>
-        <w:t xml:space="preserve">Каналы и партнерства: собственная и партнерская дистрибуция, региональная сеть, партнерские программы, экосистемные каналы, модели продаж, мотивация, маркетинг и CRM.</w:t>
-      </w:r>
-    </w:p>
-    <w:p>
-      <w:pPr>
-        <w:numPr>
-          <w:ilvl w:val="0"/>
-          <w:numId w:val="1"/>
-        </w:numPr>
-      </w:pPr>
-      <w:r>
-        <w:t xml:space="preserve">Технологии и delivery: процессинг, технологические миграции, Agile, трайбы, IT-трансформация, кросс-функциональные команды, бесшовные переключения клиентских сервисов.</w:t>
-      </w:r>
-    </w:p>
-    <w:p>
-      <w:pPr>
-        <w:numPr>
-          <w:ilvl w:val="0"/>
-          <w:numId w:val="1"/>
-        </w:numPr>
-      </w:pPr>
-      <w:r>
-        <w:t xml:space="preserve">Регуляторика и сложные контуры: федеральные проекты, взаимодействие с регулятором, платежные системы, международные расчеты, SDN, санкционные изменения, логистика и персонализация карт.</w:t>
+        <w:t xml:space="preserve">Уровень вовлеченности в областях, где есть hands-on управленческий опыт и подтвержденные бизнес-результаты.</w:t>
+      </w:r>
+    </w:p>
+    <w:p>
+      <w:r>
+        <w:t xml:space="preserve">Retail business and P&amp;L — 100% [##########]</w:t>
+      </w:r>
+    </w:p>
+    <w:p>
+      <w:r>
+        <w:t xml:space="preserve">Products and growth — 100% [##########]</w:t>
+      </w:r>
+    </w:p>
+    <w:p>
+      <w:r>
+        <w:t xml:space="preserve">Channels and partnerships — 100% [##########]</w:t>
+      </w:r>
+    </w:p>
+    <w:p>
+      <w:r>
+        <w:t xml:space="preserve">Technology and delivery — 80% [########--]</w:t>
+      </w:r>
+    </w:p>
+    <w:p>
+      <w:r>
+        <w:t xml:space="preserve">Regulatory — 70% [#######---]</w:t>
+      </w:r>
+    </w:p>
+    <w:p>
+      <w:pPr>
+        <w:pStyle w:val="Heading1"/>
+      </w:pPr>
+      <w:r>
+        <w:t xml:space="preserve">Образование и языки</w:t>
+      </w:r>
+    </w:p>
+    <w:p>
+      <w:r>
+        <w:t xml:space="preserve">МГОУ, Москва, 1998 - Менеджмент и экономическая политика, менеджер.</w:t>
+      </w:r>
+    </w:p>
+    <w:p>
+      <w:r>
+        <w:t xml:space="preserve">Языки: русский - родной; английский - C2; испанский - базовый.</w:t>
       </w:r>
     </w:p>
     <w:p>
@@ -500,20 +498,6 @@
       </w:pPr>
       <w:r>
         <w:t xml:space="preserve">Создана продуктовая модель автокредитования: 10+ основных продуктов, 300+ программ, 1,5 тыс. промо-акций; портфель вырос до 70 млрд руб., ежегодное исполнение плана по прибыли 93-104%.</w:t>
-      </w:r>
-    </w:p>
-    <w:p>
-      <w:pPr>
-        <w:pStyle w:val="Heading1"/>
-      </w:pPr>
-      <w:r>
-        <w:t xml:space="preserve">Образование и языки</w:t>
-      </w:r>
-    </w:p>
-    <w:p>
-      <w:r>
-        <w:t xml:space="preserve">МГОУ, Москва, 1998 - Менеджмент и экономическая политика, менеджер.
-Языки: русский - родной; английский - C2.</w:t>
       </w:r>
     </w:p>
     <w:sectPr>

</xml_diff>

<commit_message>
Expand metric proof blocks
Co-authored-by: yanatimofeeva2511 <yanatimofeeva2511@users.noreply.github.com>
</commit_message>
<xml_diff>
--- a/resume_clevel_fintech_ru_editable.docx
+++ b/resume_clevel_fintech_ru_editable.docx
@@ -83,34 +83,67 @@
         </w:numPr>
       </w:pPr>
       <w:r>
-        <w:t xml:space="preserve">Определяю рынок, клиентские сегменты, бизнес-модель, стратегию развития, инвестиционную логику и период окупаемости.</w:t>
-      </w:r>
-    </w:p>
-    <w:p>
-      <w:pPr>
-        <w:numPr>
-          <w:ilvl w:val="0"/>
-          <w:numId w:val="1"/>
-        </w:numPr>
-      </w:pPr>
-      <w:r>
-        <w:t xml:space="preserve">Формирую продуктовый ряд и клиентское предложение; развиваю каналы продаж, партнерские программы и дистрибуцию.</w:t>
-      </w:r>
-    </w:p>
-    <w:p>
-      <w:pPr>
-        <w:numPr>
-          <w:ilvl w:val="0"/>
-          <w:numId w:val="1"/>
-        </w:numPr>
-      </w:pPr>
-      <w:r>
-        <w:t xml:space="preserve">Собираю кросс-функциональную реализацию вместе с бизнесом, продажами, маркетингом, продуктом, операциями и IT.</w:t>
-      </w:r>
-    </w:p>
-    <w:p>
-      <w:r>
-        <w:t xml:space="preserve">Подтверждение масштаба: АКБ +11% до 2,1 млн · AUM +35% · отток снижен в 3 раза · N5 по пассивам и АКБ (+3 п.п.) · N1 по автокредитному портфелю · 88% NTB · прибыль с 36-го месяца</w:t>
+        <w:t xml:space="preserve">Определяю рынок, сегменты, бизнес-модель, стратегию, инвестиционную логику и окупаемость.</w:t>
+      </w:r>
+    </w:p>
+    <w:p>
+      <w:pPr>
+        <w:numPr>
+          <w:ilvl w:val="0"/>
+          <w:numId w:val="1"/>
+        </w:numPr>
+      </w:pPr>
+      <w:r>
+        <w:t xml:space="preserve">Формирую продуктовый ряд и клиентское предложение; развиваю каналы продаж, партнерства и дистрибуцию.</w:t>
+      </w:r>
+    </w:p>
+    <w:p>
+      <w:r>
+        <w:t xml:space="preserve">Подтверждение масштаба:</w:t>
+      </w:r>
+    </w:p>
+    <w:p>
+      <w:pPr>
+        <w:numPr>
+          <w:ilvl w:val="0"/>
+          <w:numId w:val="1"/>
+        </w:numPr>
+      </w:pPr>
+      <w:r>
+        <w:t xml:space="preserve">2,1 млн — активная клиентская база в Открытии после запуска пассивного и расчетного бизнеса; рост +11% при переходе к доходной модели.</w:t>
+      </w:r>
+    </w:p>
+    <w:p>
+      <w:pPr>
+        <w:numPr>
+          <w:ilvl w:val="0"/>
+          <w:numId w:val="1"/>
+        </w:numPr>
+      </w:pPr>
+      <w:r>
+        <w:t xml:space="preserve">AUM +35% — улучшение качества клиентского сегмента одновременно со снижением транзакционного оттока в 3 раза.</w:t>
+      </w:r>
+    </w:p>
+    <w:p>
+      <w:pPr>
+        <w:numPr>
+          <w:ilvl w:val="0"/>
+          <w:numId w:val="1"/>
+        </w:numPr>
+      </w:pPr>
+      <w:r>
+        <w:t xml:space="preserve">N1 / 88% NTB — автокредитование ВТБ24: stand-alone бизнес-модель, 25% притока клиентов розницы, 88% новых клиентов.</w:t>
+      </w:r>
+    </w:p>
+    <w:p>
+      <w:pPr>
+        <w:numPr>
+          <w:ilvl w:val="0"/>
+          <w:numId w:val="1"/>
+        </w:numPr>
+      </w:pPr>
+      <w:r>
+        <w:t xml:space="preserve">36-й месяц — выход автокредитного бизнеса на прибыль с момента запуска.</w:t>
       </w:r>
     </w:p>
     <w:p>
@@ -129,7 +162,7 @@
         </w:numPr>
       </w:pPr>
       <w:r>
-        <w:t xml:space="preserve">Диагностирую действующую модель бизнеса и определяю, какие изменения нужны под новые цели роста и доходности.</w:t>
+        <w:t xml:space="preserve">Диагностирую модель бизнеса и определяю изменения под новые цели роста и доходности.</w:t>
       </w:r>
     </w:p>
     <w:p>
@@ -144,19 +177,52 @@
       </w:r>
     </w:p>
     <w:p>
-      <w:pPr>
-        <w:numPr>
-          <w:ilvl w:val="0"/>
-          <w:numId w:val="1"/>
-        </w:numPr>
-      </w:pPr>
-      <w:r>
-        <w:t xml:space="preserve">Провожу изменения в работающем контуре банка: продукт, процессы, технологии, оргструктура и клиентский опыт.</w:t>
-      </w:r>
-    </w:p>
-    <w:p>
-      <w:r>
-        <w:t xml:space="preserve">Подтверждение масштаба: 25 млн клиентов · +25% YoY к активной клиентской базе · N2 по АКБ · масштабная IT-трансформация · P&amp;L / CIR / pNPS / MAU / DAU</w:t>
+      <w:r>
+        <w:t xml:space="preserve">Подтверждение масштаба:</w:t>
+      </w:r>
+    </w:p>
+    <w:p>
+      <w:pPr>
+        <w:numPr>
+          <w:ilvl w:val="0"/>
+          <w:numId w:val="1"/>
+        </w:numPr>
+      </w:pPr>
+      <w:r>
+        <w:t xml:space="preserve">25 млн — клиентов в дебетовых картах и расчетных продуктах ВТБ после корректировки стратегии роста.</w:t>
+      </w:r>
+    </w:p>
+    <w:p>
+      <w:pPr>
+        <w:numPr>
+          <w:ilvl w:val="0"/>
+          <w:numId w:val="1"/>
+        </w:numPr>
+      </w:pPr>
+      <w:r>
+        <w:t xml:space="preserve">+25% YoY — рост активной клиентской базы за счет продуктовых, маркетинговых и дистрибуционных изменений.</w:t>
+      </w:r>
+    </w:p>
+    <w:p>
+      <w:pPr>
+        <w:numPr>
+          <w:ilvl w:val="0"/>
+          <w:numId w:val="1"/>
+        </w:numPr>
+      </w:pPr>
+      <w:r>
+        <w:t xml:space="preserve">N2 по АКБ — итоговая рыночная позиция направления после трансформации модели работы.</w:t>
+      </w:r>
+    </w:p>
+    <w:p>
+      <w:pPr>
+        <w:numPr>
+          <w:ilvl w:val="0"/>
+          <w:numId w:val="1"/>
+        </w:numPr>
+      </w:pPr>
+      <w:r>
+        <w:t xml:space="preserve">IT-трансформация — изменения в продукте, маркетинге и каналах проведены параллельно с масштабной технологической программой.</w:t>
       </w:r>
     </w:p>
     <w:p>
@@ -175,34 +241,67 @@
         </w:numPr>
       </w:pPr>
       <w:r>
-        <w:t xml:space="preserve">Формирую концепт проекта, систему принятия решений и общие цели для бизнеса, IT, операций, продаж, маркетинга, регулятора и внешних партнеров.</w:t>
-      </w:r>
-    </w:p>
-    <w:p>
-      <w:pPr>
-        <w:numPr>
-          <w:ilvl w:val="0"/>
-          <w:numId w:val="1"/>
-        </w:numPr>
-      </w:pPr>
-      <w:r>
-        <w:t xml:space="preserve">Организую Agile-команды и крупные delivery-программы; удерживаю результат в условиях высокой организационной и технологической сложности.</w:t>
-      </w:r>
-    </w:p>
-    <w:p>
-      <w:pPr>
-        <w:numPr>
-          <w:ilvl w:val="0"/>
-          <w:numId w:val="1"/>
-        </w:numPr>
-      </w:pPr>
-      <w:r>
-        <w:t xml:space="preserve">Обеспечиваю бесшовность критичных изменений для клиентов и операционного контура.</w:t>
-      </w:r>
-    </w:p>
-    <w:p>
-      <w:r>
-        <w:t xml:space="preserve">Подтверждение масштаба: 1,5 млн клиентов / 8 процессингов · 20 млн клиентов без простоя · 2 млн детей за 8 месяцев · 170 человек / 12 команд · SDN-контур</w:t>
+        <w:t xml:space="preserve">Формирую концепт, систему принятия решений и общие цели для бизнеса, IT, операций, продаж, маркетинга, регулятора и партнеров.</w:t>
+      </w:r>
+    </w:p>
+    <w:p>
+      <w:pPr>
+        <w:numPr>
+          <w:ilvl w:val="0"/>
+          <w:numId w:val="1"/>
+        </w:numPr>
+      </w:pPr>
+      <w:r>
+        <w:t xml:space="preserve">Организую Agile-команды и крупные delivery-программы; обеспечиваю бесшовность критичных изменений для клиентов.</w:t>
+      </w:r>
+    </w:p>
+    <w:p>
+      <w:r>
+        <w:t xml:space="preserve">Подтверждение масштаба:</w:t>
+      </w:r>
+    </w:p>
+    <w:p>
+      <w:pPr>
+        <w:numPr>
+          <w:ilvl w:val="0"/>
+          <w:numId w:val="1"/>
+        </w:numPr>
+      </w:pPr>
+      <w:r>
+        <w:t xml:space="preserve">20 млн — действующих клиентов ВТБ переведены на новый процессинг без простоя в операциях.</w:t>
+      </w:r>
+    </w:p>
+    <w:p>
+      <w:pPr>
+        <w:numPr>
+          <w:ilvl w:val="0"/>
+          <w:numId w:val="1"/>
+        </w:numPr>
+      </w:pPr>
+      <w:r>
+        <w:t xml:space="preserve">2 млн / 8 мес. — детей с Пушкинскими картами мигрированы в федеральном проекте: продукт, процесс, интеграции, нормативная база.</w:t>
+      </w:r>
+    </w:p>
+    <w:p>
+      <w:pPr>
+        <w:numPr>
+          <w:ilvl w:val="0"/>
+          <w:numId w:val="1"/>
+        </w:numPr>
+      </w:pPr>
+      <w:r>
+        <w:t xml:space="preserve">1,5 млн / 8 — клиентов Открытия мигрированы на разных продуктовых линейках и 8 процессингах без клиентского оттока.</w:t>
+      </w:r>
+    </w:p>
+    <w:p>
+      <w:pPr>
+        <w:numPr>
+          <w:ilvl w:val="0"/>
+          <w:numId w:val="1"/>
+        </w:numPr>
+      </w:pPr>
+      <w:r>
+        <w:t xml:space="preserve">170 / 12 — масштаб управления delivery: 170 человек, продукт + IT, штат/аутсорс, 12 бизнес-команд.</w:t>
       </w:r>
     </w:p>
     <w:p>

</xml_diff>

<commit_message>
Use original examples in focus sections
Co-authored-by: yanatimofeeva2511 <yanatimofeeva2511@users.noreply.github.com>
</commit_message>
<xml_diff>
--- a/resume_clevel_fintech_ru_editable.docx
+++ b/resume_clevel_fintech_ru_editable.docx
@@ -43,7 +43,7 @@
     </w:p>
     <w:p>
       <w:r>
-        <w:t xml:space="preserve">Моя ценность - в ситуациях, где нужно быстро соединить стратегию, экономику продукта, операционную модель и delivery в измеримый результат: запустить направление с нуля, перестроить действующую модель или провести сложную программу без потери клиентского опыта.</w:t>
+        <w:t xml:space="preserve">Моя ценность - быстро соединить стратегию, экономику продукта, операционную модель и delivery в измеримый результат: запустить направление с нуля, перестроить действующую модель или провести сложную программу без потери клиентского опыта.</w:t>
       </w:r>
     </w:p>
     <w:p>
@@ -51,12 +51,134 @@
         <w:pStyle w:val="Heading1"/>
       </w:pPr>
       <w:r>
-        <w:t xml:space="preserve">Целевые роли</w:t>
-      </w:r>
-    </w:p>
-    <w:p>
-      <w:r>
-        <w:t xml:space="preserve">Chief Business Officer / Chief Product Officer / Chief Operating Officer / Head of Retail Banking / Managing Director по розничному бизнесу, продуктам, платежам, клиентским платформам или трансформации финансового бизнеса.</w:t>
+        <w:t xml:space="preserve">Управленческий фокус и примеры результата</w:t>
+      </w:r>
+    </w:p>
+    <w:p>
+      <w:pPr>
+        <w:pStyle w:val="Heading2"/>
+      </w:pPr>
+      <w:r>
+        <w:t xml:space="preserve">BUILD - запуск самостоятельных бизнес-направлений</w:t>
+      </w:r>
+    </w:p>
+    <w:p>
+      <w:r>
+        <w:t xml:space="preserve">Запуск направления с нуля: рынок, бизнес-модель, продуктовый ряд, каналы продаж, партнерства и экономика окупаемости.</w:t>
+      </w:r>
+    </w:p>
+    <w:p>
+      <w:r>
+        <w:t xml:space="preserve">Крупные метрики: АКБ +11% · 2,1 млн · AUM +35% · отток - в 3 раза · №1 / 88% NTB · 36 месяц</w:t>
+      </w:r>
+    </w:p>
+    <w:p>
+      <w:r>
+        <w:t xml:space="preserve">Примеры:</w:t>
+      </w:r>
+    </w:p>
+    <w:p>
+      <w:pPr>
+        <w:numPr>
+          <w:ilvl w:val="0"/>
+          <w:numId w:val="1"/>
+        </w:numPr>
+      </w:pPr>
+      <w:r>
+        <w:t xml:space="preserve">ФК Банк ОТКРЫТИЕ: запуск пассивного и расчетного бизнеса (депозитные, инвестиционные и страховые продукты, дебетовые карты, зарплатные проекты). При смене бизнес-модели на доходный бизнес и одновременном ухудшении ценовых параметров продуктового ряда удалось нарастить АКБ на 11%  до 2,1 млн. клиентов  с одновременным замещением качества клиентского сегмента (рост среднего AUM на 35%, сокращение транзакционного оттока в 3 раза, вывод РКО  на самоокупаемость). Итоговая рыночная позиция: №5 (+3пп) по портфелю пассивов и АКБ</w:t>
+      </w:r>
+    </w:p>
+    <w:p>
+      <w:pPr>
+        <w:numPr>
+          <w:ilvl w:val="0"/>
+          <w:numId w:val="1"/>
+        </w:numPr>
+      </w:pPr>
+      <w:r>
+        <w:t xml:space="preserve">ВТБ24: Запуск Автокредитования. Выстроена stand-alone бизнес-модель с собственной и партнерской сетью дистрибуции, обеспечивающая приток 25% клиентов розничного бизнеса (88% NTB). Бизнес в прибыли с 36 месяца с момента запуска. Итоговая рыночная позиция: №1  по кредитному портфелю</w:t>
+      </w:r>
+    </w:p>
+    <w:p>
+      <w:pPr>
+        <w:pStyle w:val="Heading2"/>
+      </w:pPr>
+      <w:r>
+        <w:t xml:space="preserve">TRANSFORM - корректировка существующей модели</w:t>
+      </w:r>
+    </w:p>
+    <w:p>
+      <w:r>
+        <w:t xml:space="preserve">Пересборка стратегии, экономики привлечения, продукта, дистрибуции, IT и операционной модели в работающем контуре банка.</w:t>
+      </w:r>
+    </w:p>
+    <w:p>
+      <w:r>
+        <w:t xml:space="preserve">Крупные метрики: №2 по АКБ · 25 млн · +25% YoY · IT-трансформация</w:t>
+      </w:r>
+    </w:p>
+    <w:p>
+      <w:r>
+        <w:t xml:space="preserve">Примеры:</w:t>
+      </w:r>
+    </w:p>
+    <w:p>
+      <w:pPr>
+        <w:numPr>
+          <w:ilvl w:val="0"/>
+          <w:numId w:val="1"/>
+        </w:numPr>
+      </w:pPr>
+      <w:r>
+        <w:t xml:space="preserve">ВТБ Дебетовые карты и расчетные продукты: Скорректирована стратегия под наращивание клиентской базы, определены инструменты и стоимость привлечения, найдены источники финансирования. Внедрены продуктовые, маркетинговые, дистрибуционные изменения одновременно с масштабной ИТ-трансформацией. Итоговая рыночная позиция: №2 по АКБ, 25 млн. клиентов (рост +25% YoY)</w:t>
+      </w:r>
+    </w:p>
+    <w:p>
+      <w:pPr>
+        <w:pStyle w:val="Heading2"/>
+      </w:pPr>
+      <w:r>
+        <w:t xml:space="preserve">LEAD - сложные программы с большим количеством участников</w:t>
+      </w:r>
+    </w:p>
+    <w:p>
+      <w:r>
+        <w:t xml:space="preserve">Управление программами, где нужно синхронизировать бизнес, IT, операции, продажи, маркетинг, регулятора и внешних партнеров.</w:t>
+      </w:r>
+    </w:p>
+    <w:p>
+      <w:r>
+        <w:t xml:space="preserve">Крупные метрики: 1,5 млн / 8 · 20 млн · 2 млн / 8 мес. · SDN · Agile</w:t>
+      </w:r>
+    </w:p>
+    <w:p>
+      <w:r>
+        <w:t xml:space="preserve">Примеры:</w:t>
+      </w:r>
+    </w:p>
+    <w:p>
+      <w:pPr>
+        <w:numPr>
+          <w:ilvl w:val="0"/>
+          <w:numId w:val="1"/>
+        </w:numPr>
+      </w:pPr>
+      <w:r>
+        <w:t xml:space="preserve">ФК Банк Открытие: - бизнес и технологическая миграция  1.5 млн. клиентов на различных продуктовых линейках на 8 процессингах  без оттока клиентов.
+- переход  структуры управления и разработки на Agile. Создание Трайбов, старт управления ИТ-командами.
+- управление первой волной SDN, отключение платежных систем, международных расчетов, синхронизация всех подразделений банка и регулятора для взаимодействия с клиентами в условиях отсутствия внешних и внутренних процедур. Урегулирование требований к платежным системам. Изменение правил логистики и персонализации, управление стоками пластика в условиях дефицита чипов.</w:t>
+      </w:r>
+    </w:p>
+    <w:p>
+      <w:pPr>
+        <w:numPr>
+          <w:ilvl w:val="0"/>
+          <w:numId w:val="1"/>
+        </w:numPr>
+      </w:pPr>
+      <w:r>
+        <w:t xml:space="preserve">ВТБ: - импортозамещение, бесшовная замена процессинга для 20 млн действующих клиентов  без простоя в операциях.
+- федеральный проект по миграции 2 млн детей с Пушкинскими картами за 8 месяцев (концепция, разработка продукта, разработка процесса миграции, тех.интеграции с регулятором, нормативная база, бесшовное переключение)</w:t>
       </w:r>
     </w:p>
     <w:p>
@@ -64,257 +186,7 @@
         <w:pStyle w:val="Heading1"/>
       </w:pPr>
       <w:r>
-        <w:t xml:space="preserve">Управленческий фокус</w:t>
-      </w:r>
-    </w:p>
-    <w:p>
-      <w:pPr>
-        <w:pStyle w:val="Heading2"/>
-      </w:pPr>
-      <w:r>
-        <w:t xml:space="preserve">BUILD - запуск самостоятельных бизнес-направлений</w:t>
-      </w:r>
-    </w:p>
-    <w:p>
-      <w:pPr>
-        <w:numPr>
-          <w:ilvl w:val="0"/>
-          <w:numId w:val="1"/>
-        </w:numPr>
-      </w:pPr>
-      <w:r>
-        <w:t xml:space="preserve">Определяю рынок, сегменты, бизнес-модель, стратегию, инвестиционную логику и окупаемость.</w:t>
-      </w:r>
-    </w:p>
-    <w:p>
-      <w:pPr>
-        <w:numPr>
-          <w:ilvl w:val="0"/>
-          <w:numId w:val="1"/>
-        </w:numPr>
-      </w:pPr>
-      <w:r>
-        <w:t xml:space="preserve">Формирую продуктовый ряд и клиентское предложение; развиваю каналы продаж, партнерства и дистрибуцию.</w:t>
-      </w:r>
-    </w:p>
-    <w:p>
-      <w:r>
-        <w:t xml:space="preserve">Подтверждение масштаба:</w:t>
-      </w:r>
-    </w:p>
-    <w:p>
-      <w:pPr>
-        <w:numPr>
-          <w:ilvl w:val="0"/>
-          <w:numId w:val="1"/>
-        </w:numPr>
-      </w:pPr>
-      <w:r>
-        <w:t xml:space="preserve">2,1 млн — активная клиентская база в Открытии после запуска пассивного и расчетного бизнеса; рост +11% при переходе к доходной модели.</w:t>
-      </w:r>
-    </w:p>
-    <w:p>
-      <w:pPr>
-        <w:numPr>
-          <w:ilvl w:val="0"/>
-          <w:numId w:val="1"/>
-        </w:numPr>
-      </w:pPr>
-      <w:r>
-        <w:t xml:space="preserve">AUM +35% — улучшение качества клиентского сегмента одновременно со снижением транзакционного оттока в 3 раза.</w:t>
-      </w:r>
-    </w:p>
-    <w:p>
-      <w:pPr>
-        <w:numPr>
-          <w:ilvl w:val="0"/>
-          <w:numId w:val="1"/>
-        </w:numPr>
-      </w:pPr>
-      <w:r>
-        <w:t xml:space="preserve">N1 / 88% NTB — автокредитование ВТБ24: stand-alone бизнес-модель, 25% притока клиентов розницы, 88% новых клиентов.</w:t>
-      </w:r>
-    </w:p>
-    <w:p>
-      <w:pPr>
-        <w:numPr>
-          <w:ilvl w:val="0"/>
-          <w:numId w:val="1"/>
-        </w:numPr>
-      </w:pPr>
-      <w:r>
-        <w:t xml:space="preserve">36-й месяц — выход автокредитного бизнеса на прибыль с момента запуска.</w:t>
-      </w:r>
-    </w:p>
-    <w:p>
-      <w:pPr>
-        <w:pStyle w:val="Heading2"/>
-      </w:pPr>
-      <w:r>
-        <w:t xml:space="preserve">TRANSFORM - корректировка существующей модели</w:t>
-      </w:r>
-    </w:p>
-    <w:p>
-      <w:pPr>
-        <w:numPr>
-          <w:ilvl w:val="0"/>
-          <w:numId w:val="1"/>
-        </w:numPr>
-      </w:pPr>
-      <w:r>
-        <w:t xml:space="preserve">Диагностирую модель бизнеса и определяю изменения под новые цели роста и доходности.</w:t>
-      </w:r>
-    </w:p>
-    <w:p>
-      <w:pPr>
-        <w:numPr>
-          <w:ilvl w:val="0"/>
-          <w:numId w:val="1"/>
-        </w:numPr>
-      </w:pPr>
-      <w:r>
-        <w:t xml:space="preserve">Пересобираю стратегию, экономику привлечения, источники финансирования, продуктовые приоритеты и операционную модель.</w:t>
-      </w:r>
-    </w:p>
-    <w:p>
-      <w:r>
-        <w:t xml:space="preserve">Подтверждение масштаба:</w:t>
-      </w:r>
-    </w:p>
-    <w:p>
-      <w:pPr>
-        <w:numPr>
-          <w:ilvl w:val="0"/>
-          <w:numId w:val="1"/>
-        </w:numPr>
-      </w:pPr>
-      <w:r>
-        <w:t xml:space="preserve">25 млн — клиентов в дебетовых картах и расчетных продуктах ВТБ после корректировки стратегии роста.</w:t>
-      </w:r>
-    </w:p>
-    <w:p>
-      <w:pPr>
-        <w:numPr>
-          <w:ilvl w:val="0"/>
-          <w:numId w:val="1"/>
-        </w:numPr>
-      </w:pPr>
-      <w:r>
-        <w:t xml:space="preserve">+25% YoY — рост активной клиентской базы за счет продуктовых, маркетинговых и дистрибуционных изменений.</w:t>
-      </w:r>
-    </w:p>
-    <w:p>
-      <w:pPr>
-        <w:numPr>
-          <w:ilvl w:val="0"/>
-          <w:numId w:val="1"/>
-        </w:numPr>
-      </w:pPr>
-      <w:r>
-        <w:t xml:space="preserve">N2 по АКБ — итоговая рыночная позиция направления после трансформации модели работы.</w:t>
-      </w:r>
-    </w:p>
-    <w:p>
-      <w:pPr>
-        <w:numPr>
-          <w:ilvl w:val="0"/>
-          <w:numId w:val="1"/>
-        </w:numPr>
-      </w:pPr>
-      <w:r>
-        <w:t xml:space="preserve">IT-трансформация — изменения в продукте, маркетинге и каналах проведены параллельно с масштабной технологической программой.</w:t>
-      </w:r>
-    </w:p>
-    <w:p>
-      <w:pPr>
-        <w:pStyle w:val="Heading2"/>
-      </w:pPr>
-      <w:r>
-        <w:t xml:space="preserve">LEAD - сложные программы с большим количеством участников</w:t>
-      </w:r>
-    </w:p>
-    <w:p>
-      <w:pPr>
-        <w:numPr>
-          <w:ilvl w:val="0"/>
-          <w:numId w:val="1"/>
-        </w:numPr>
-      </w:pPr>
-      <w:r>
-        <w:t xml:space="preserve">Формирую концепт, систему принятия решений и общие цели для бизнеса, IT, операций, продаж, маркетинга, регулятора и партнеров.</w:t>
-      </w:r>
-    </w:p>
-    <w:p>
-      <w:pPr>
-        <w:numPr>
-          <w:ilvl w:val="0"/>
-          <w:numId w:val="1"/>
-        </w:numPr>
-      </w:pPr>
-      <w:r>
-        <w:t xml:space="preserve">Организую Agile-команды и крупные delivery-программы; обеспечиваю бесшовность критичных изменений для клиентов.</w:t>
-      </w:r>
-    </w:p>
-    <w:p>
-      <w:r>
-        <w:t xml:space="preserve">Подтверждение масштаба:</w:t>
-      </w:r>
-    </w:p>
-    <w:p>
-      <w:pPr>
-        <w:numPr>
-          <w:ilvl w:val="0"/>
-          <w:numId w:val="1"/>
-        </w:numPr>
-      </w:pPr>
-      <w:r>
-        <w:t xml:space="preserve">20 млн — действующих клиентов ВТБ переведены на новый процессинг без простоя в операциях.</w:t>
-      </w:r>
-    </w:p>
-    <w:p>
-      <w:pPr>
-        <w:numPr>
-          <w:ilvl w:val="0"/>
-          <w:numId w:val="1"/>
-        </w:numPr>
-      </w:pPr>
-      <w:r>
-        <w:t xml:space="preserve">2 млн / 8 мес. — детей с Пушкинскими картами мигрированы в федеральном проекте: продукт, процесс, интеграции, нормативная база.</w:t>
-      </w:r>
-    </w:p>
-    <w:p>
-      <w:pPr>
-        <w:numPr>
-          <w:ilvl w:val="0"/>
-          <w:numId w:val="1"/>
-        </w:numPr>
-      </w:pPr>
-      <w:r>
-        <w:t xml:space="preserve">1,5 млн / 8 — клиентов Открытия мигрированы на разных продуктовых линейках и 8 процессингах без клиентского оттока.</w:t>
-      </w:r>
-    </w:p>
-    <w:p>
-      <w:pPr>
-        <w:numPr>
-          <w:ilvl w:val="0"/>
-          <w:numId w:val="1"/>
-        </w:numPr>
-      </w:pPr>
-      <w:r>
-        <w:t xml:space="preserve">170 / 12 — масштаб управления delivery: 170 человек, продукт + IT, штат/аутсорс, 12 бизнес-команд.</w:t>
-      </w:r>
-    </w:p>
-    <w:p>
-      <w:pPr>
-        <w:pStyle w:val="Heading1"/>
-      </w:pPr>
-      <w:r>
         <w:t xml:space="preserve">Зоны практической экспертизы</w:t>
-      </w:r>
-    </w:p>
-    <w:p>
-      <w:r>
-        <w:t xml:space="preserve">Уровень вовлеченности в областях, где есть hands-on управленческий опыт и подтвержденные бизнес-результаты.</w:t>
       </w:r>
     </w:p>
     <w:p>

</xml_diff>

<commit_message>
Add strategic banking framing
Co-authored-by: yanatimofeeva2511 <yanatimofeeva2511@users.noreply.github.com>
</commit_message>
<xml_diff>
--- a/resume_clevel_fintech_ru_editable.docx
+++ b/resume_clevel_fintech_ru_editable.docx
@@ -15,12 +15,12 @@
         <w:pStyle w:val="Subtitle"/>
       </w:pPr>
       <w:r>
-        <w:t xml:space="preserve">C-level лидер | розничный банкинг, финтех и платежная инфраструктура</w:t>
-      </w:r>
-    </w:p>
-    <w:p>
-      <w:r>
-        <w:t xml:space="preserve">BUILD / TRANSFORM / LEAD: запуск бизнес-направлений, трансформация продуктовых моделей, управление крупными программами изменений</w:t>
+        <w:t xml:space="preserve">C-level лидер | розничный банкинг, финтех и трансформация клиентских платформ</w:t>
+      </w:r>
+    </w:p>
+    <w:p>
+      <w:r>
+        <w:t xml:space="preserve">Стратегия роста · operating model · продуктовый P&amp;L · regulated delivery · mission-critical banking infrastructure</w:t>
       </w:r>
     </w:p>
     <w:p>
@@ -38,12 +38,12 @@
     </w:p>
     <w:p>
       <w:r>
-        <w:t xml:space="preserve">Бизнес-лидер с 20+ годами опыта в крупнейших финансовых организациях России. Отвечаю за розничные направления, запуск новых продуктов, клиентский рост, партнерскую дистрибуцию, технологические миграции и федеральные проекты на стыке бизнеса, IT, операций, маркетинга, продаж и регуляторного контура.</w:t>
-      </w:r>
-    </w:p>
-    <w:p>
-      <w:r>
-        <w:t xml:space="preserve">Моя ценность - быстро соединить стратегию, экономику продукта, операционную модель и delivery в измеримый результат: запустить направление с нуля, перестроить действующую модель или провести сложную программу без потери клиентского опыта.</w:t>
+        <w:t xml:space="preserve">Бизнес-лидер с 20+ годами опыта в крупнейших финансовых организациях России. Работаю не только с отдельными продуктами, а с масштабными банковскими бизнес-системами: клиентские платформы, P&amp;L, продуктовая архитектура, каналы дистрибуции, партнерская экосистема, критичная платежная инфраструктура и регуляторный контур.</w:t>
+      </w:r>
+    </w:p>
+    <w:p>
+      <w:r>
+        <w:t xml:space="preserve">Моя ценность - соединять стратегическое видение и банковский execution: определить, какую бизнес-модель нужно построить или изменить, собрать operating model и довести программу до измеримого результата без потери клиентского опыта.</w:t>
       </w:r>
     </w:p>
     <w:p>
@@ -51,6 +51,58 @@
         <w:pStyle w:val="Heading1"/>
       </w:pPr>
       <w:r>
+        <w:t xml:space="preserve">Масштаб видения</w:t>
+      </w:r>
+    </w:p>
+    <w:p>
+      <w:pPr>
+        <w:numPr>
+          <w:ilvl w:val="0"/>
+          <w:numId w:val="1"/>
+        </w:numPr>
+      </w:pPr>
+      <w:r>
+        <w:t xml:space="preserve">Business architecture: от клиентского сегмента и P&amp;L до каналов, продукта и операций.</w:t>
+      </w:r>
+    </w:p>
+    <w:p>
+      <w:pPr>
+        <w:numPr>
+          <w:ilvl w:val="0"/>
+          <w:numId w:val="1"/>
+        </w:numPr>
+      </w:pPr>
+      <w:r>
+        <w:t xml:space="preserve">Client platforms: ежедневный банкинг, платежи, карты, РКО, федеральные клиентские сценарии.</w:t>
+      </w:r>
+    </w:p>
+    <w:p>
+      <w:pPr>
+        <w:numPr>
+          <w:ilvl w:val="0"/>
+          <w:numId w:val="1"/>
+        </w:numPr>
+      </w:pPr>
+      <w:r>
+        <w:t xml:space="preserve">Operating model: Agile, трайбы, кросс-функциональные команды, IT/business governance.</w:t>
+      </w:r>
+    </w:p>
+    <w:p>
+      <w:pPr>
+        <w:numPr>
+          <w:ilvl w:val="0"/>
+          <w:numId w:val="1"/>
+        </w:numPr>
+      </w:pPr>
+      <w:r>
+        <w:t xml:space="preserve">Regulated delivery: процессинг, платежные системы, SDN, регулятор, бесшовные миграции.</w:t>
+      </w:r>
+    </w:p>
+    <w:p>
+      <w:pPr>
+        <w:pStyle w:val="Heading1"/>
+      </w:pPr>
+      <w:r>
         <w:t xml:space="preserve">Управленческий фокус и примеры результата</w:t>
       </w:r>
     </w:p>
@@ -64,7 +116,7 @@
     </w:p>
     <w:p>
       <w:r>
-        <w:t xml:space="preserve">Запуск направления с нуля: рынок, бизнес-модель, продуктовый ряд, каналы продаж, партнерства и экономика окупаемости.</w:t>
+        <w:t xml:space="preserve">Создаю не отдельный продукт, а самостоятельную бизнес-систему: целевой рынок, клиентские сегменты, P&amp;L-логику, продуктовый портфель, каналы, партнерства и модель окупаемости.</w:t>
       </w:r>
     </w:p>
     <w:p>
@@ -109,7 +161,7 @@
     </w:p>
     <w:p>
       <w:r>
-        <w:t xml:space="preserve">Пересборка стратегии, экономики привлечения, продукта, дистрибуции, IT и операционной модели в работающем контуре банка.</w:t>
+        <w:t xml:space="preserve">Перевожу действующий банковский портфель в новую модель роста: стратегия, экономика привлечения, продуктовая архитектура, дистрибуция, IT-roadmap, операционная модель и KPI управления.</w:t>
       </w:r>
     </w:p>
     <w:p>
@@ -143,7 +195,7 @@
     </w:p>
     <w:p>
       <w:r>
-        <w:t xml:space="preserve">Управление программами, где нужно синхронизировать бизнес, IT, операции, продажи, маркетинг, регулятора и внешних партнеров.</w:t>
+        <w:t xml:space="preserve">Веду mission-critical программы в регулируемой среде: синхронизирую бизнес, IT, операции, продажи, маркетинг, взаимодействие с регулятором и внешними партнерами вокруг непрерывности клиентского опыта.</w:t>
       </w:r>
     </w:p>
     <w:p>

</xml_diff>